<commit_message>
data structure dict assignment
</commit_message>
<xml_diff>
--- a/MYSQL/Demo/23_views.docx
+++ b/MYSQL/Demo/23_views.docx
@@ -43,6 +43,7 @@
           <w:rFonts w:ascii="Times New Roman" w:eastAsia="Times New Roman" w:hAnsi="Times New Roman" w:cs="Times New Roman"/>
           <w:b/>
           <w:bCs/>
+          <w:noProof/>
           <w:sz w:val="27"/>
           <w:szCs w:val="27"/>
           <w:lang w:eastAsia="en-IN" w:bidi="mr-IN"/>
@@ -83,8 +84,6 @@
           </wp:inline>
         </w:drawing>
       </w:r>
-      <w:bookmarkStart w:id="0" w:name="_GoBack"/>
-      <w:bookmarkEnd w:id="0"/>
     </w:p>
     <w:p>
       <w:pPr>
@@ -597,15 +596,44 @@
           <w:lang w:eastAsia="en-IN" w:bidi="mr-IN"/>
         </w:rPr>
       </w:pPr>
-      <w:r>
-        <w:rPr>
-          <w:rFonts w:ascii="Times New Roman" w:eastAsia="Times New Roman" w:hAnsi="Times New Roman" w:cs="Times New Roman"/>
-          <w:b/>
-          <w:bCs/>
-          <w:sz w:val="27"/>
-          <w:szCs w:val="27"/>
-          <w:lang w:eastAsia="en-IN" w:bidi="mr-IN"/>
-        </w:rPr>
+    </w:p>
+    <w:p>
+      <w:pPr>
+        <w:spacing w:before="100" w:beforeAutospacing="1" w:after="100" w:afterAutospacing="1" w:line="240" w:lineRule="auto"/>
+        <w:outlineLvl w:val="2"/>
+        <w:rPr>
+          <w:rFonts w:ascii="Times New Roman" w:eastAsia="Times New Roman" w:hAnsi="Times New Roman" w:cs="Times New Roman"/>
+          <w:b/>
+          <w:bCs/>
+          <w:sz w:val="27"/>
+          <w:szCs w:val="27"/>
+          <w:lang w:eastAsia="en-IN" w:bidi="mr-IN"/>
+        </w:rPr>
+      </w:pPr>
+    </w:p>
+    <w:p>
+      <w:pPr>
+        <w:spacing w:before="100" w:beforeAutospacing="1" w:after="100" w:afterAutospacing="1" w:line="240" w:lineRule="auto"/>
+        <w:outlineLvl w:val="2"/>
+        <w:rPr>
+          <w:rFonts w:ascii="Times New Roman" w:eastAsia="Times New Roman" w:hAnsi="Times New Roman" w:cs="Times New Roman"/>
+          <w:b/>
+          <w:bCs/>
+          <w:sz w:val="27"/>
+          <w:szCs w:val="27"/>
+          <w:lang w:eastAsia="en-IN" w:bidi="mr-IN"/>
+        </w:rPr>
+      </w:pPr>
+      <w:r>
+        <w:rPr>
+          <w:rFonts w:ascii="Times New Roman" w:eastAsia="Times New Roman" w:hAnsi="Times New Roman" w:cs="Times New Roman"/>
+          <w:b/>
+          <w:bCs/>
+          <w:sz w:val="27"/>
+          <w:szCs w:val="27"/>
+          <w:lang w:eastAsia="en-IN" w:bidi="mr-IN"/>
+        </w:rPr>
+        <w:lastRenderedPageBreak/>
         <w:t xml:space="preserve">Q6) Delete records from the </w:t>
       </w:r>
       <w:proofErr w:type="spellStart"/>
@@ -646,6 +674,7 @@
           <w:lang w:eastAsia="en-IN" w:bidi="mr-IN"/>
         </w:rPr>
       </w:pPr>
+      <w:bookmarkStart w:id="0" w:name="_GoBack"/>
       <w:r>
         <w:rPr>
           <w:rFonts w:ascii="Times New Roman" w:eastAsia="Times New Roman" w:hAnsi="Times New Roman" w:cs="Times New Roman"/>
@@ -656,11 +685,10 @@
           <w:szCs w:val="27"/>
           <w:lang w:eastAsia="en-IN" w:bidi="mr-IN"/>
         </w:rPr>
-        <w:lastRenderedPageBreak/>
         <w:drawing>
-          <wp:inline distT="0" distB="0" distL="0" distR="0" wp14:anchorId="7B66EC0C" wp14:editId="12B8AF53">
-            <wp:extent cx="5731510" cy="1878037"/>
-            <wp:effectExtent l="0" t="0" r="2540" b="8255"/>
+          <wp:inline distT="0" distB="0" distL="0" distR="0" wp14:anchorId="7B66EC0C" wp14:editId="549AFD81">
+            <wp:extent cx="5730467" cy="1551008"/>
+            <wp:effectExtent l="0" t="0" r="3810" b="0"/>
             <wp:docPr id="7" name="Picture 7"/>
             <wp:cNvGraphicFramePr>
               <a:graphicFrameLocks xmlns:a="http://schemas.openxmlformats.org/drawingml/2006/main" noChangeAspect="1"/>
@@ -681,7 +709,7 @@
                   <pic:spPr>
                     <a:xfrm>
                       <a:off x="0" y="0"/>
-                      <a:ext cx="5735216" cy="1879251"/>
+                      <a:ext cx="5741203" cy="1553914"/>
                     </a:xfrm>
                     <a:prstGeom prst="rect">
                       <a:avLst/>
@@ -693,6 +721,7 @@
           </wp:inline>
         </w:drawing>
       </w:r>
+      <w:bookmarkEnd w:id="0"/>
     </w:p>
     <w:p>
       <w:pPr>
@@ -767,8 +796,8 @@
           <w:lang w:eastAsia="en-IN" w:bidi="mr-IN"/>
         </w:rPr>
         <w:drawing>
-          <wp:inline distT="0" distB="0" distL="0" distR="0" wp14:anchorId="10B3FD9A" wp14:editId="2AD691BF">
-            <wp:extent cx="5731510" cy="959485"/>
+          <wp:inline distT="0" distB="0" distL="0" distR="0" wp14:anchorId="10B3FD9A" wp14:editId="01084FA1">
+            <wp:extent cx="5731510" cy="781292"/>
             <wp:effectExtent l="0" t="0" r="2540" b="0"/>
             <wp:docPr id="8" name="Picture 8"/>
             <wp:cNvGraphicFramePr>
@@ -790,7 +819,7 @@
                   <pic:spPr>
                     <a:xfrm>
                       <a:off x="0" y="0"/>
-                      <a:ext cx="5731510" cy="959485"/>
+                      <a:ext cx="5746319" cy="783311"/>
                     </a:xfrm>
                     <a:prstGeom prst="rect">
                       <a:avLst/>
@@ -876,9 +905,9 @@
           <w:lang w:eastAsia="en-IN" w:bidi="mr-IN"/>
         </w:rPr>
         <w:drawing>
-          <wp:inline distT="0" distB="0" distL="0" distR="0" wp14:anchorId="1C99728F" wp14:editId="7AFF4BBB">
-            <wp:extent cx="5731510" cy="2762885"/>
-            <wp:effectExtent l="0" t="0" r="2540" b="0"/>
+          <wp:inline distT="0" distB="0" distL="0" distR="0" wp14:anchorId="1C99728F" wp14:editId="2623FE47">
+            <wp:extent cx="5731510" cy="2320724"/>
+            <wp:effectExtent l="0" t="0" r="2540" b="3810"/>
             <wp:docPr id="9" name="Picture 9"/>
             <wp:cNvGraphicFramePr>
               <a:graphicFrameLocks xmlns:a="http://schemas.openxmlformats.org/drawingml/2006/main" noChangeAspect="1"/>
@@ -899,7 +928,7 @@
                   <pic:spPr>
                     <a:xfrm>
                       <a:off x="0" y="0"/>
-                      <a:ext cx="5731510" cy="2762885"/>
+                      <a:ext cx="5743429" cy="2325550"/>
                     </a:xfrm>
                     <a:prstGeom prst="rect">
                       <a:avLst/>
@@ -984,7 +1013,6 @@
           <w:szCs w:val="27"/>
           <w:lang w:eastAsia="en-IN" w:bidi="mr-IN"/>
         </w:rPr>
-        <w:lastRenderedPageBreak/>
         <w:drawing>
           <wp:inline distT="0" distB="0" distL="0" distR="0" wp14:anchorId="5AE986A6" wp14:editId="02707D5C">
             <wp:extent cx="5731510" cy="1594485"/>
@@ -1044,6 +1072,7 @@
           <w:szCs w:val="27"/>
           <w:lang w:eastAsia="en-IN" w:bidi="mr-IN"/>
         </w:rPr>
+        <w:lastRenderedPageBreak/>
         <w:t>Q10) Write the general syntax to create a view.</w:t>
       </w:r>
     </w:p>

</xml_diff>